<commit_message>
Agregar Teoria del Cambio, objetivos y componentes al TP2
Parte de la tabla propia del equipo y la ajusta segun la devolucion del taller: reemplaza la mesa de articulacion por consorcio, convenios y contratos; saca la logistica duplicada; hace visible el riesgo de incendios; agrega indicadores con linea de base y supuestos. Metas numericas quedan a definir por el equipo. Se integra al Word consolidado en una seccion horizontal.

Co-Authored-By: Claude Sonnet 5.5 <noreply@anthropic.com>
</commit_message>
<xml_diff>
--- a/docs/plantillas/Formulario_Perfil_Polo_Forestal_Actualizado.docx
+++ b/docs/plantillas/Formulario_Perfil_Polo_Forestal_Actualizado.docx
@@ -42,7 +42,7 @@
           <w:i/>
           <w:color w:val="555555"/>
         </w:rPr>
-        <w:t>Fuentes: docs/proyecto-resumen.md (TP1) y docs/tp2-formulario-perfil-entrega2.md (TP2) del repositorio. Incorpora: (1) la reconciliación con la bifurcación del Google Doc "Formulario_Perfil_Polo_Forestal" — se adoptó el ajuste del procedimiento de recupero de inversión (2 mecanismos), se dejaron pendientes los datos administrativos (organismo, responsable, fecha, tipología); y (2) la validación técnica de Damián Soto (Ingeniero Forestal, CORFO / Secretaría de Bosques de Chubut, 2026-10-01): se descarta el biochar, se corrige la causa de "obsolescencia tecnológica" y se precisa el rol de los tratamientos silvícolas en el riesgo de incendios.</w:t>
+        <w:t>Fuentes: docs/proyecto-resumen.md (TP1), docs/tp2-formulario-perfil-entrega2.md (TP2) y docs/teoria-del-cambio.md del repositorio. Incorpora: (1) la reconciliación con la bifurcación del Google Doc "Formulario_Perfil_Polo_Forestal" — se adoptó el ajuste del procedimiento de recupero de inversión (2 mecanismos) y se dejaron pendientes los datos administrativos (organismo, responsable, fecha, tipología); (2) la validación técnica de Damián Soto (Ingeniero Forestal, CORFO / Secretaría de Bosques de Chubut, 2026-10-01): se descarta el biochar, se corrige la causa de "obsolescencia tecnológica" y se precisa el rol de los tratamientos silvícolas en el riesgo de incendios; y (3) la devolución del taller de Teoría del Cambio, reflejada en la Teoría del Cambio del Anexo.</w:t>
       </w:r>
     </w:p>
     <w:p>
@@ -1458,6 +1458,889 @@
     <w:p/>
     <w:p>
       <w:pPr>
+        <w:sectPr>
+          <w:pgSz w:w="12240" w:h="15840"/>
+          <w:pgMar w:top="1134" w:right="1247" w:bottom="1134" w:left="1247" w:header="720" w:footer="720" w:gutter="0"/>
+          <w:cols w:space="720"/>
+          <w:docGrid w:linePitch="360"/>
+        </w:sectPr>
+      </w:pPr>
+    </w:p>
+    <w:p>
+      <w:pPr>
+        <w:pStyle w:val="Heading2"/>
+      </w:pPr>
+      <w:r>
+        <w:t>Descripción general, Teoría del Cambio, objetivos y componentes (Parte A)</w:t>
+      </w:r>
+    </w:p>
+    <w:p>
+      <w:r>
+        <w:rPr>
+          <w:b w:val="0"/>
+          <w:i w:val="0"/>
+          <w:sz w:val="22"/>
+        </w:rPr>
+        <w:t>Teoría del cambio: si los aserraderos y pymes del Noroeste de Chubut acceden a infraestructura industrial compartida, a una logística de abastecimiento común y a servicios de clasificación y certificación, y si el Polo se sostiene con un consorcio de gestión formalizado por convenios y contratos, entonces aumentan el valor agregado y la calidad de la madera de pino, se valoriza la biomasa residual y se reduce la carga de combustible acumulada; con ello mejoran la competitividad y el empleo de la cadena y se reduce el riesgo de incendios forestales.</w:t>
+      </w:r>
+    </w:p>
+    <w:p>
+      <w:r>
+        <w:rPr>
+          <w:b/>
+          <w:i w:val="0"/>
+          <w:sz w:val="22"/>
+        </w:rPr>
+        <w:t>Problema general: Escasa, obsoleta e inadecuada estructura tecnológica e industrial para el desarrollo de la cadena foresto-industrial en el Noroeste de Chubut.</w:t>
+      </w:r>
+    </w:p>
+    <w:tbl>
+      <w:tblPr>
+        <w:tblStyle w:val="LightGrid-Accent1"/>
+        <w:tblW w:type="auto" w:w="0"/>
+        <w:jc w:val="center"/>
+        <w:tblLook w:firstColumn="1" w:firstRow="1" w:lastColumn="0" w:lastRow="0" w:noHBand="0" w:noVBand="1" w:val="04A0"/>
+      </w:tblPr>
+      <w:tblGrid>
+        <w:gridCol w:w="2300"/>
+        <w:gridCol w:w="2300"/>
+        <w:gridCol w:w="2300"/>
+        <w:gridCol w:w="2300"/>
+        <w:gridCol w:w="2300"/>
+        <w:gridCol w:w="2300"/>
+      </w:tblGrid>
+      <w:tr>
+        <w:tc>
+          <w:tcPr>
+            <w:tcW w:type="dxa" w:w="1814"/>
+            <w:shd w:val="clear" w:color="auto" w:fill="2E5B3C"/>
+          </w:tcPr>
+          <w:p>
+            <w:r>
+              <w:rPr>
+                <w:b/>
+                <w:color w:val="FFFFFF"/>
+                <w:sz w:val="17"/>
+              </w:rPr>
+              <w:t>Problema específico</w:t>
+            </w:r>
+          </w:p>
+        </w:tc>
+        <w:tc>
+          <w:tcPr>
+            <w:tcW w:type="dxa" w:w="2835"/>
+            <w:shd w:val="clear" w:color="auto" w:fill="2E5B3C"/>
+          </w:tcPr>
+          <w:p>
+            <w:r>
+              <w:rPr>
+                <w:b/>
+                <w:color w:val="FFFFFF"/>
+                <w:sz w:val="17"/>
+              </w:rPr>
+              <w:t>Determinantes</w:t>
+            </w:r>
+          </w:p>
+        </w:tc>
+        <w:tc>
+          <w:tcPr>
+            <w:tcW w:type="dxa" w:w="2494"/>
+            <w:shd w:val="clear" w:color="auto" w:fill="2E5B3C"/>
+          </w:tcPr>
+          <w:p>
+            <w:r>
+              <w:rPr>
+                <w:b/>
+                <w:color w:val="FFFFFF"/>
+                <w:sz w:val="17"/>
+              </w:rPr>
+              <w:t>Intervención</w:t>
+            </w:r>
+          </w:p>
+        </w:tc>
+        <w:tc>
+          <w:tcPr>
+            <w:tcW w:type="dxa" w:w="2494"/>
+            <w:shd w:val="clear" w:color="auto" w:fill="2E5B3C"/>
+          </w:tcPr>
+          <w:p>
+            <w:r>
+              <w:rPr>
+                <w:b/>
+                <w:color w:val="FFFFFF"/>
+                <w:sz w:val="17"/>
+              </w:rPr>
+              <w:t>Productos</w:t>
+            </w:r>
+          </w:p>
+        </w:tc>
+        <w:tc>
+          <w:tcPr>
+            <w:tcW w:type="dxa" w:w="2154"/>
+            <w:shd w:val="clear" w:color="auto" w:fill="2E5B3C"/>
+          </w:tcPr>
+          <w:p>
+            <w:r>
+              <w:rPr>
+                <w:b/>
+                <w:color w:val="FFFFFF"/>
+                <w:sz w:val="17"/>
+              </w:rPr>
+              <w:t>Resultados</w:t>
+            </w:r>
+          </w:p>
+        </w:tc>
+        <w:tc>
+          <w:tcPr>
+            <w:tcW w:type="dxa" w:w="2381"/>
+            <w:shd w:val="clear" w:color="auto" w:fill="2E5B3C"/>
+          </w:tcPr>
+          <w:p>
+            <w:r>
+              <w:rPr>
+                <w:b/>
+                <w:color w:val="FFFFFF"/>
+                <w:sz w:val="17"/>
+              </w:rPr>
+              <w:t>Indicador (línea de base → meta)</w:t>
+            </w:r>
+          </w:p>
+        </w:tc>
+      </w:tr>
+      <w:tr>
+        <w:tc>
+          <w:tcPr>
+            <w:tcW w:type="dxa" w:w="1814"/>
+          </w:tcPr>
+          <w:p>
+            <w:r>
+              <w:rPr>
+                <w:sz w:val="17"/>
+              </w:rPr>
+              <w:t>1. Ineficiente logística de extracción y manejo del recurso</w:t>
+            </w:r>
+          </w:p>
+        </w:tc>
+        <w:tc>
+          <w:tcPr>
+            <w:tcW w:type="dxa" w:w="2835"/>
+          </w:tcPr>
+          <w:p>
+            <w:r>
+              <w:rPr>
+                <w:sz w:val="17"/>
+              </w:rPr>
+              <w:t>Costos de extracción y transporte elevados, sin escala común. Biomasa dispersa y de acceso dificultoso. Nodos fuera del radio logístico óptimo (25-30 km): Corcovado a 46 km, $288/t vs. El Hoyo $228/t (CIEFAP, Pub. Téc. 34).</w:t>
+            </w:r>
+          </w:p>
+        </w:tc>
+        <w:tc>
+          <w:tcPr>
+            <w:tcW w:type="dxa" w:w="2494"/>
+          </w:tcPr>
+          <w:p>
+            <w:r>
+              <w:rPr>
+                <w:sz w:val="17"/>
+              </w:rPr>
+              <w:t>Coordinación logística centralizada a través del Polo (acopio y transporte común).</w:t>
+            </w:r>
+          </w:p>
+        </w:tc>
+        <w:tc>
+          <w:tcPr>
+            <w:tcW w:type="dxa" w:w="2494"/>
+          </w:tcPr>
+          <w:p>
+            <w:r>
+              <w:rPr>
+                <w:sz w:val="17"/>
+              </w:rPr>
+              <w:t>Protocolo logístico común de acopio y transporte. Plan de abastecimiento por nodos.</w:t>
+            </w:r>
+          </w:p>
+        </w:tc>
+        <w:tc>
+          <w:tcPr>
+            <w:tcW w:type="dxa" w:w="2154"/>
+          </w:tcPr>
+          <w:p>
+            <w:r>
+              <w:rPr>
+                <w:sz w:val="17"/>
+              </w:rPr>
+              <w:t>Reducción de costos logísticos de extracción y transporte.</w:t>
+            </w:r>
+          </w:p>
+        </w:tc>
+        <w:tc>
+          <w:tcPr>
+            <w:tcW w:type="dxa" w:w="2381"/>
+          </w:tcPr>
+          <w:p>
+            <w:r>
+              <w:rPr>
+                <w:sz w:val="17"/>
+              </w:rPr>
+              <w:t>Costo de biomasa puesta en planta (USD/t): línea de base $228-322/t según nodo → meta a definir.</w:t>
+            </w:r>
+          </w:p>
+        </w:tc>
+      </w:tr>
+      <w:tr>
+        <w:tc>
+          <w:tcPr>
+            <w:tcW w:type="dxa" w:w="1814"/>
+          </w:tcPr>
+          <w:p>
+            <w:r>
+              <w:rPr>
+                <w:sz w:val="17"/>
+              </w:rPr>
+              <w:t>2. Baja escala y falta de infraestructura compartida (60% de la biomasa generada no se aprovecha económicamente)</w:t>
+            </w:r>
+          </w:p>
+        </w:tc>
+        <w:tc>
+          <w:tcPr>
+            <w:tcW w:type="dxa" w:w="2835"/>
+          </w:tcPr>
+          <w:p>
+            <w:r>
+              <w:rPr>
+                <w:sz w:val="17"/>
+              </w:rPr>
+              <w:t>Insuficiente capacidad instalada para transformación primaria y secundaria. Ausencia de infraestructura tecnológica compartida (secaderos, plantas de tratamiento, laboratorios). Tecnología a pequeña escala, sin sistematización industrial del aserrío (D. Soto).</w:t>
+            </w:r>
+          </w:p>
+        </w:tc>
+        <w:tc>
+          <w:tcPr>
+            <w:tcW w:type="dxa" w:w="2494"/>
+          </w:tcPr>
+          <w:p>
+            <w:r>
+              <w:rPr>
+                <w:sz w:val="17"/>
+              </w:rPr>
+              <w:t>Construcción y puesta en marcha del Polo centralizado (Trevelin/Epuyén): secado industrial y líneas de chipeado/peletizado de pino.</w:t>
+            </w:r>
+          </w:p>
+        </w:tc>
+        <w:tc>
+          <w:tcPr>
+            <w:tcW w:type="dxa" w:w="2494"/>
+          </w:tcPr>
+          <w:p>
+            <w:r>
+              <w:rPr>
+                <w:sz w:val="17"/>
+              </w:rPr>
+              <w:t>Polo operativo (referencia: 24.700 t/año de chips o 12.600 t/año de pellets). Chips y pellets de pino certificados. Servicios tarifados de acceso abierto para los 51 aserraderos.</w:t>
+            </w:r>
+          </w:p>
+        </w:tc>
+        <w:tc>
+          <w:tcPr>
+            <w:tcW w:type="dxa" w:w="2154"/>
+          </w:tcPr>
+          <w:p>
+            <w:r>
+              <w:rPr>
+                <w:sz w:val="17"/>
+              </w:rPr>
+              <w:t>Mayor aprovechamiento de biomasa sobre el 60% actual sin uso.</w:t>
+            </w:r>
+          </w:p>
+        </w:tc>
+        <w:tc>
+          <w:tcPr>
+            <w:tcW w:type="dxa" w:w="2381"/>
+          </w:tcPr>
+          <w:p>
+            <w:r>
+              <w:rPr>
+                <w:sz w:val="17"/>
+              </w:rPr>
+              <w:t>% de biomasa aprovechada: línea de base 40% → meta a definir. Aserraderos usuarios: 0 de 51 → meta a definir.</w:t>
+            </w:r>
+          </w:p>
+        </w:tc>
+      </w:tr>
+      <w:tr>
+        <w:tc>
+          <w:tcPr>
+            <w:tcW w:type="dxa" w:w="1814"/>
+          </w:tcPr>
+          <w:p>
+            <w:r>
+              <w:rPr>
+                <w:sz w:val="17"/>
+              </w:rPr>
+              <w:t>3. Acumulación de biomasa y riesgo de incendios</w:t>
+            </w:r>
+          </w:p>
+        </w:tc>
+        <w:tc>
+          <w:tcPr>
+            <w:tcW w:type="dxa" w:w="2835"/>
+          </w:tcPr>
+          <w:p>
+            <w:r>
+              <w:rPr>
+                <w:sz w:val="17"/>
+              </w:rPr>
+              <w:t>Falta de tratamientos silvícolas (podas y raleos) durante años (D. Soto). Residuo sin mercado que se acumula como combustible. Inventario forestal desactualizado (último 2013-2014).</w:t>
+            </w:r>
+          </w:p>
+        </w:tc>
+        <w:tc>
+          <w:tcPr>
+            <w:tcW w:type="dxa" w:w="2494"/>
+          </w:tcPr>
+          <w:p>
+            <w:r>
+              <w:rPr>
+                <w:sz w:val="17"/>
+              </w:rPr>
+              <w:t>Valorización industrial de la biomasa de podas, raleos y aserradero mediante contratos de abastecimiento con contratistas de saca y aserraderos. Relevamiento dasométrico actualizado (en Prefactibilidad).</w:t>
+            </w:r>
+          </w:p>
+        </w:tc>
+        <w:tc>
+          <w:tcPr>
+            <w:tcW w:type="dxa" w:w="2494"/>
+          </w:tcPr>
+          <w:p>
+            <w:r>
+              <w:rPr>
+                <w:sz w:val="17"/>
+              </w:rPr>
+              <w:t>Contratos de abastecimiento firmados. Inventario dasométrico actualizado. Protocolo de origen sostenible (pino de bosque implantado; sin uso intensivo de bosque nativo).</w:t>
+            </w:r>
+          </w:p>
+        </w:tc>
+        <w:tc>
+          <w:tcPr>
+            <w:tcW w:type="dxa" w:w="2154"/>
+          </w:tcPr>
+          <w:p>
+            <w:r>
+              <w:rPr>
+                <w:sz w:val="17"/>
+              </w:rPr>
+              <w:t>Menor carga de combustible acumulada en el área de influencia; el proyecto contribuye a reducir el riesgo de incendios (no lo resuelve por sí solo).</w:t>
+            </w:r>
+          </w:p>
+        </w:tc>
+        <w:tc>
+          <w:tcPr>
+            <w:tcW w:type="dxa" w:w="2381"/>
+          </w:tcPr>
+          <w:p>
+            <w:r>
+              <w:rPr>
+                <w:sz w:val="17"/>
+              </w:rPr>
+              <w:t>Toneladas de biomasa residual retiradas por año y hectáreas con podas/raleos: línea de base a relevar → meta a definir. Contexto: ~177.200 ha afectadas por incendios de magnitud entre 2014-15 y 2025-26 (Secretaría de Bosques).</w:t>
+            </w:r>
+          </w:p>
+        </w:tc>
+      </w:tr>
+      <w:tr>
+        <w:tc>
+          <w:tcPr>
+            <w:tcW w:type="dxa" w:w="1814"/>
+          </w:tcPr>
+          <w:p>
+            <w:r>
+              <w:rPr>
+                <w:sz w:val="17"/>
+              </w:rPr>
+              <w:t>4. Débil articulación técnico-institucional</w:t>
+            </w:r>
+          </w:p>
+        </w:tc>
+        <w:tc>
+          <w:tcPr>
+            <w:tcW w:type="dxa" w:w="2835"/>
+          </w:tcPr>
+          <w:p>
+            <w:r>
+              <w:rPr>
+                <w:sz w:val="17"/>
+              </w:rPr>
+              <w:t>Insuficiente articulación entre CIEFAP, INTA, UNPSJB y el sector productivo. Ausencia de un actor que traccione la inversión (el sector privado no puede afrontarla solo). Antecedentes de asistencias técnicas inconclusas.</w:t>
+            </w:r>
+          </w:p>
+        </w:tc>
+        <w:tc>
+          <w:tcPr>
+            <w:tcW w:type="dxa" w:w="2494"/>
+          </w:tcPr>
+          <w:p>
+            <w:r>
+              <w:rPr>
+                <w:sz w:val="17"/>
+              </w:rPr>
+              <w:t>Consorcio de gestión del Polo (Estado provincial, sector privado y sistema científico-tecnológico) formalizado por convenio, con roles, reglas y financiamiento definidos. Convenios de transferencia tecnológica.</w:t>
+            </w:r>
+          </w:p>
+        </w:tc>
+        <w:tc>
+          <w:tcPr>
+            <w:tcW w:type="dxa" w:w="2494"/>
+          </w:tcPr>
+          <w:p>
+            <w:r>
+              <w:rPr>
+                <w:sz w:val="17"/>
+              </w:rPr>
+              <w:t>Consorcio constituido. Convenios firmados con CIEFAP, INTA y UNPSJB. Laboratorio de I+D+i. Plan de transferencia y capacitación para pequeños productores.</w:t>
+            </w:r>
+          </w:p>
+        </w:tc>
+        <w:tc>
+          <w:tcPr>
+            <w:tcW w:type="dxa" w:w="2154"/>
+          </w:tcPr>
+          <w:p>
+            <w:r>
+              <w:rPr>
+                <w:sz w:val="17"/>
+              </w:rPr>
+              <w:t>Coordinación sostenida por instrumentos vinculantes, sin depender de reuniones periódicas.</w:t>
+            </w:r>
+          </w:p>
+        </w:tc>
+        <w:tc>
+          <w:tcPr>
+            <w:tcW w:type="dxa" w:w="2381"/>
+          </w:tcPr>
+          <w:p>
+            <w:r>
+              <w:rPr>
+                <w:sz w:val="17"/>
+              </w:rPr>
+              <w:t>Convenios vigentes y contratos de abastecimiento firmados: 0 → meta a definir.</w:t>
+            </w:r>
+          </w:p>
+        </w:tc>
+      </w:tr>
+      <w:tr>
+        <w:tc>
+          <w:tcPr>
+            <w:tcW w:type="dxa" w:w="1814"/>
+          </w:tcPr>
+          <w:p>
+            <w:r>
+              <w:rPr>
+                <w:sz w:val="17"/>
+              </w:rPr>
+              <w:t>5. Baja competitividad y falta de estandarización (el pino blanco pierde valor frente a la madera de Misiones)</w:t>
+            </w:r>
+          </w:p>
+        </w:tc>
+        <w:tc>
+          <w:tcPr>
+            <w:tcW w:type="dxa" w:w="2835"/>
+          </w:tcPr>
+          <w:p>
+            <w:r>
+              <w:rPr>
+                <w:sz w:val="17"/>
+              </w:rPr>
+              <w:t>Ausencia de protocolo de secado industrial normalizado. Falta de certificaciones bajo normas técnicas (ej. CIRSOC). Sin sello de calidad regional.</w:t>
+            </w:r>
+          </w:p>
+        </w:tc>
+        <w:tc>
+          <w:tcPr>
+            <w:tcW w:type="dxa" w:w="2494"/>
+          </w:tcPr>
+          <w:p>
+            <w:r>
+              <w:rPr>
+                <w:sz w:val="17"/>
+              </w:rPr>
+              <w:t>Líneas de clasificación y certificación de madera bajo normas técnicas vigentes.</w:t>
+            </w:r>
+          </w:p>
+        </w:tc>
+        <w:tc>
+          <w:tcPr>
+            <w:tcW w:type="dxa" w:w="2494"/>
+          </w:tcPr>
+          <w:p>
+            <w:r>
+              <w:rPr>
+                <w:sz w:val="17"/>
+              </w:rPr>
+              <w:t>Madera clasificada y secada industrialmente. Sello/certificación de calidad regional.</w:t>
+            </w:r>
+          </w:p>
+        </w:tc>
+        <w:tc>
+          <w:tcPr>
+            <w:tcW w:type="dxa" w:w="2154"/>
+          </w:tcPr>
+          <w:p>
+            <w:r>
+              <w:rPr>
+                <w:sz w:val="17"/>
+              </w:rPr>
+              <w:t>Mayor competitividad del pino blanco frente a la madera importada; mayor participación en mercados de valor y compras públicas.</w:t>
+            </w:r>
+          </w:p>
+        </w:tc>
+        <w:tc>
+          <w:tcPr>
+            <w:tcW w:type="dxa" w:w="2381"/>
+          </w:tcPr>
+          <w:p>
+            <w:r>
+              <w:rPr>
+                <w:sz w:val="17"/>
+              </w:rPr>
+              <w:t>Volumen de madera secada y clasificada (m³/año): 0 → meta a definir. Madera regional en compras públicas: línea de base a relevar.</w:t>
+            </w:r>
+          </w:p>
+        </w:tc>
+      </w:tr>
+    </w:tbl>
+    <w:p/>
+    <w:p>
+      <w:r>
+        <w:rPr>
+          <w:b/>
+          <w:i w:val="0"/>
+          <w:sz w:val="22"/>
+        </w:rPr>
+        <w:t>Resultado final (impacto): cadena foresto-industrial del Noroeste de Chubut modernizada, con mayor valor agregado y competitividad, y con menor carga de combustible acumulada.</w:t>
+      </w:r>
+    </w:p>
+    <w:p>
+      <w:pPr>
+        <w:pStyle w:val="Heading3"/>
+      </w:pPr>
+      <w:r>
+        <w:t>Supuestos</w:t>
+      </w:r>
+    </w:p>
+    <w:p>
+      <w:pPr>
+        <w:pStyle w:val="ListBullet"/>
+      </w:pPr>
+      <w:r>
+        <w:rPr>
+          <w:b/>
+        </w:rPr>
+        <w:t xml:space="preserve">Condiciones iniciales: </w:t>
+      </w:r>
+      <w:r>
+        <w:t>se obtiene el financiamiento de inversión (CFI u otra fuente) y se define la localización final (Trevelin o Epuyén).</w:t>
+      </w:r>
+    </w:p>
+    <w:p>
+      <w:pPr>
+        <w:pStyle w:val="ListBullet"/>
+      </w:pPr>
+      <w:r>
+        <w:rPr>
+          <w:b/>
+        </w:rPr>
+        <w:t xml:space="preserve">Implementación: </w:t>
+      </w:r>
+      <w:r>
+        <w:t>los aserraderos y pymes usan los servicios del Polo con tarifas accesibles; los contratistas de saca entregan biomasa de forma sostenida.</w:t>
+      </w:r>
+    </w:p>
+    <w:p>
+      <w:pPr>
+        <w:pStyle w:val="ListBullet"/>
+      </w:pPr>
+      <w:r>
+        <w:rPr>
+          <w:b/>
+        </w:rPr>
+        <w:t xml:space="preserve">Desarrollo: </w:t>
+      </w:r>
+      <w:r>
+        <w:t>hay oferta suficiente de biomasa de pino implantado (depende de que se realicen podas y raleos y de contar con un inventario actualizado); la demanda institucional se concreta mediante contratos.</w:t>
+      </w:r>
+    </w:p>
+    <w:p>
+      <w:pPr>
+        <w:pStyle w:val="ListBullet"/>
+      </w:pPr>
+      <w:r>
+        <w:rPr>
+          <w:b/>
+        </w:rPr>
+        <w:t xml:space="preserve">Sostenibilidad: </w:t>
+      </w:r>
+      <w:r>
+        <w:t>el consorcio cubre los costos operativos con ingresos por tarifas y venta de productos; se fiscaliza el origen legal de la madera.</w:t>
+      </w:r>
+    </w:p>
+    <w:p>
+      <w:pPr>
+        <w:pStyle w:val="Heading3"/>
+      </w:pPr>
+      <w:r>
+        <w:t>Objetivo general y objetivos específicos por componente</w:t>
+      </w:r>
+    </w:p>
+    <w:p>
+      <w:r>
+        <w:rPr>
+          <w:b w:val="0"/>
+          <w:i w:val="0"/>
+          <w:sz w:val="22"/>
+        </w:rPr>
+        <w:t>Objetivo general: fortalecer y modernizar la estructura tecnológica e industrial de la cadena foresto-industrial del Noroeste de Chubut mediante un Polo Tecnológico Forestal de servicios compartidos, que incremente la capacidad de transformación, el aprovechamiento integral del recurso, la generación de valor agregado y la competitividad sectorial.</w:t>
+      </w:r>
+    </w:p>
+    <w:tbl>
+      <w:tblPr>
+        <w:tblStyle w:val="LightGrid-Accent1"/>
+        <w:tblW w:type="auto" w:w="0"/>
+        <w:jc w:val="center"/>
+        <w:tblLook w:firstColumn="1" w:firstRow="1" w:lastColumn="0" w:lastRow="0" w:noHBand="0" w:noVBand="1" w:val="04A0"/>
+      </w:tblPr>
+      <w:tblGrid>
+        <w:gridCol w:w="4600"/>
+        <w:gridCol w:w="4600"/>
+        <w:gridCol w:w="4600"/>
+      </w:tblGrid>
+      <w:tr>
+        <w:tc>
+          <w:tcPr>
+            <w:tcW w:type="dxa" w:w="3118"/>
+            <w:shd w:val="clear" w:color="auto" w:fill="2E5B3C"/>
+          </w:tcPr>
+          <w:p>
+            <w:r>
+              <w:rPr>
+                <w:b/>
+                <w:color w:val="FFFFFF"/>
+                <w:sz w:val="18"/>
+              </w:rPr>
+              <w:t>Componente</w:t>
+            </w:r>
+          </w:p>
+        </w:tc>
+        <w:tc>
+          <w:tcPr>
+            <w:tcW w:type="dxa" w:w="5669"/>
+            <w:shd w:val="clear" w:color="auto" w:fill="2E5B3C"/>
+          </w:tcPr>
+          <w:p>
+            <w:r>
+              <w:rPr>
+                <w:b/>
+                <w:color w:val="FFFFFF"/>
+                <w:sz w:val="18"/>
+              </w:rPr>
+              <w:t>Objetivo específico</w:t>
+            </w:r>
+          </w:p>
+        </w:tc>
+        <w:tc>
+          <w:tcPr>
+            <w:tcW w:type="dxa" w:w="5102"/>
+            <w:shd w:val="clear" w:color="auto" w:fill="2E5B3C"/>
+          </w:tcPr>
+          <w:p>
+            <w:r>
+              <w:rPr>
+                <w:b/>
+                <w:color w:val="FFFFFF"/>
+                <w:sz w:val="18"/>
+              </w:rPr>
+              <w:t>Productos</w:t>
+            </w:r>
+          </w:p>
+        </w:tc>
+      </w:tr>
+      <w:tr>
+        <w:tc>
+          <w:tcPr>
+            <w:tcW w:type="dxa" w:w="3118"/>
+          </w:tcPr>
+          <w:p>
+            <w:r>
+              <w:rPr>
+                <w:sz w:val="18"/>
+              </w:rPr>
+              <w:t>1. Infraestructura industrial compartida</w:t>
+            </w:r>
+          </w:p>
+        </w:tc>
+        <w:tc>
+          <w:tcPr>
+            <w:tcW w:type="dxa" w:w="5669"/>
+          </w:tcPr>
+          <w:p>
+            <w:r>
+              <w:rPr>
+                <w:sz w:val="18"/>
+              </w:rPr>
+              <w:t>Desarrollar infraestructura y equipamiento compartido para la transformación primaria y secundaria de madera y biomasa de pino.</w:t>
+            </w:r>
+          </w:p>
+        </w:tc>
+        <w:tc>
+          <w:tcPr>
+            <w:tcW w:type="dxa" w:w="5102"/>
+          </w:tcPr>
+          <w:p>
+            <w:r>
+              <w:rPr>
+                <w:sz w:val="18"/>
+              </w:rPr>
+              <w:t>Polo operativo; chips y pellets de pino certificados; servicios tarifados de acceso abierto.</w:t>
+            </w:r>
+          </w:p>
+        </w:tc>
+      </w:tr>
+      <w:tr>
+        <w:tc>
+          <w:tcPr>
+            <w:tcW w:type="dxa" w:w="3118"/>
+          </w:tcPr>
+          <w:p>
+            <w:r>
+              <w:rPr>
+                <w:sz w:val="18"/>
+              </w:rPr>
+              <w:t>2. Logística y abastecimiento sostenible de biomasa</w:t>
+            </w:r>
+          </w:p>
+        </w:tc>
+        <w:tc>
+          <w:tcPr>
+            <w:tcW w:type="dxa" w:w="5669"/>
+          </w:tcPr>
+          <w:p>
+            <w:r>
+              <w:rPr>
+                <w:sz w:val="18"/>
+              </w:rPr>
+              <w:t>Reducir los costos de extracción y transporte y asegurar un abastecimiento sostenible que reduzca la carga de combustible.</w:t>
+            </w:r>
+          </w:p>
+        </w:tc>
+        <w:tc>
+          <w:tcPr>
+            <w:tcW w:type="dxa" w:w="5102"/>
+          </w:tcPr>
+          <w:p>
+            <w:r>
+              <w:rPr>
+                <w:sz w:val="18"/>
+              </w:rPr>
+              <w:t>Protocolo logístico común; contratos de abastecimiento; inventario dasométrico actualizado; protocolo de origen sostenible.</w:t>
+            </w:r>
+          </w:p>
+        </w:tc>
+      </w:tr>
+      <w:tr>
+        <w:tc>
+          <w:tcPr>
+            <w:tcW w:type="dxa" w:w="3118"/>
+          </w:tcPr>
+          <w:p>
+            <w:r>
+              <w:rPr>
+                <w:sz w:val="18"/>
+              </w:rPr>
+              <w:t>3. Calidad, clasificación y certificación</w:t>
+            </w:r>
+          </w:p>
+        </w:tc>
+        <w:tc>
+          <w:tcPr>
+            <w:tcW w:type="dxa" w:w="5669"/>
+          </w:tcPr>
+          <w:p>
+            <w:r>
+              <w:rPr>
+                <w:sz w:val="18"/>
+              </w:rPr>
+              <w:t>Incorporar secado, clasificación, estandarización y certificación para mejorar la competitividad del pino regional.</w:t>
+            </w:r>
+          </w:p>
+        </w:tc>
+        <w:tc>
+          <w:tcPr>
+            <w:tcW w:type="dxa" w:w="5102"/>
+          </w:tcPr>
+          <w:p>
+            <w:r>
+              <w:rPr>
+                <w:sz w:val="18"/>
+              </w:rPr>
+              <w:t>Madera clasificada y secada industrialmente; sello/certificación de calidad regional.</w:t>
+            </w:r>
+          </w:p>
+        </w:tc>
+      </w:tr>
+      <w:tr>
+        <w:tc>
+          <w:tcPr>
+            <w:tcW w:type="dxa" w:w="3118"/>
+          </w:tcPr>
+          <w:p>
+            <w:r>
+              <w:rPr>
+                <w:sz w:val="18"/>
+              </w:rPr>
+              <w:t>4. Gobernanza y transferencia tecnológica</w:t>
+            </w:r>
+          </w:p>
+        </w:tc>
+        <w:tc>
+          <w:tcPr>
+            <w:tcW w:type="dxa" w:w="5669"/>
+          </w:tcPr>
+          <w:p>
+            <w:r>
+              <w:rPr>
+                <w:sz w:val="18"/>
+              </w:rPr>
+              <w:t>Consolidar la articulación entre Estado, sector privado y sistema científico-tecnológico y transferir tecnología a los pequeños productores.</w:t>
+            </w:r>
+          </w:p>
+        </w:tc>
+        <w:tc>
+          <w:tcPr>
+            <w:tcW w:type="dxa" w:w="5102"/>
+          </w:tcPr>
+          <w:p>
+            <w:r>
+              <w:rPr>
+                <w:sz w:val="18"/>
+              </w:rPr>
+              <w:t>Consorcio de gestión; convenios con CIEFAP, INTA y UNPSJB; laboratorio de I+D+i; plan de transferencia y capacitación.</w:t>
+            </w:r>
+          </w:p>
+        </w:tc>
+      </w:tr>
+    </w:tbl>
+    <w:p/>
+    <w:p>
+      <w:pPr>
+        <w:sectPr>
+          <w:pgSz w:w="15840" w:h="12240" w:orient="landscape"/>
+          <w:pgMar w:top="1020" w:right="1020" w:bottom="1020" w:left="1020" w:header="720" w:footer="720" w:gutter="0"/>
+          <w:cols w:space="720"/>
+          <w:docGrid w:linePitch="360"/>
+        </w:sectPr>
+      </w:pPr>
+    </w:p>
+    <w:p>
+      <w:pPr>
         <w:pStyle w:val="Heading2"/>
       </w:pPr>
       <w:r>
@@ -1563,6 +2446,20 @@
       </w:r>
       <w:r>
         <w:t>el proyecto busca reducir este riesgo al valorizar biomasa que hoy se acumula como combustible — impacto positivo/mitigación, no riesgo del proyecto.</w:t>
+      </w:r>
+    </w:p>
+    <w:p>
+      <w:pPr>
+        <w:pStyle w:val="ListBullet"/>
+      </w:pPr>
+      <w:r>
+        <w:rPr>
+          <w:b/>
+        </w:rPr>
+        <w:t xml:space="preserve">Pinos no nativos: </w:t>
+      </w:r>
+      <w:r>
+        <w:t>pendiente de consulta con el Ing. Damián Soto: cómo se encuadra el proyecto frente a la dispersión de pinos no nativos (pregunta de la devolución del taller).</w:t>
       </w:r>
     </w:p>
     <w:p>
@@ -1679,6 +2576,34 @@
               <w:rPr>
                 <w:sz w:val="20"/>
               </w:rPr>
+              <w:t>Teoría del Cambio, objetivos y componentes</w:t>
+            </w:r>
+          </w:p>
+        </w:tc>
+        <w:tc>
+          <w:tcPr>
+            <w:tcW w:type="dxa" w:w="4535"/>
+          </w:tcPr>
+          <w:p>
+            <w:r>
+              <w:rPr>
+                <w:sz w:val="20"/>
+              </w:rPr>
+              <w:t>Resuelto en esta versión; metas numéricas "a definir" por el equipo</w:t>
+            </w:r>
+          </w:p>
+        </w:tc>
+      </w:tr>
+      <w:tr>
+        <w:tc>
+          <w:tcPr>
+            <w:tcW w:type="dxa" w:w="4535"/>
+          </w:tcPr>
+          <w:p>
+            <w:r>
+              <w:rPr>
+                <w:sz w:val="20"/>
+              </w:rPr>
               <w:t>Datos de cabecera (nombre, provincia)</w:t>
             </w:r>
           </w:p>
@@ -1720,7 +2645,7 @@
               <w:rPr>
                 <w:sz w:val="20"/>
               </w:rPr>
-              <w:t>Pendiente — requiere ingeniería básica</w:t>
+              <w:t>Pendiente — requiere ingeniería básica (o adoptar la cota inferior USD 1.519.362)</w:t>
             </w:r>
           </w:p>
         </w:tc>
@@ -1916,7 +2841,7 @@
               <w:rPr>
                 <w:sz w:val="20"/>
               </w:rPr>
-              <w:t>Análisis comparativo preliminar hecho</w:t>
+              <w:t>Análisis comparativo preliminar hecho; falta tabla de permisos por alternativa</w:t>
             </w:r>
           </w:p>
         </w:tc>
@@ -1972,7 +2897,7 @@
               <w:rPr>
                 <w:sz w:val="20"/>
               </w:rPr>
-              <w:t>Pendiente crítico — no verificado en ninguna fuente</w:t>
+              <w:t>Pendiente crítico — no verificado en ninguna fuente (corresponde a Entrega 3)</w:t>
             </w:r>
           </w:p>
         </w:tc>
@@ -2029,6 +2954,34 @@
                 <w:sz w:val="20"/>
               </w:rPr>
               <w:t>Pendiente — último relevamiento 2013-2014 (dato aportado por Damián Soto)</w:t>
+            </w:r>
+          </w:p>
+        </w:tc>
+      </w:tr>
+      <w:tr>
+        <w:tc>
+          <w:tcPr>
+            <w:tcW w:type="dxa" w:w="4535"/>
+          </w:tcPr>
+          <w:p>
+            <w:r>
+              <w:rPr>
+                <w:sz w:val="20"/>
+              </w:rPr>
+              <w:t>Pinos no nativos (devolución del taller)</w:t>
+            </w:r>
+          </w:p>
+        </w:tc>
+        <w:tc>
+          <w:tcPr>
+            <w:tcW w:type="dxa" w:w="4535"/>
+          </w:tcPr>
+          <w:p>
+            <w:r>
+              <w:rPr>
+                <w:sz w:val="20"/>
+              </w:rPr>
+              <w:t>Pendiente de consulta con Damián Soto</w:t>
             </w:r>
           </w:p>
         </w:tc>

</xml_diff>